<commit_message>
Ementa: conteúdo programático de cada módulo vira lista, não parágrafo corrido
No .md, cada "Encontro/Aula — título (Nh)" vinha colado na lista de tópicos sem
linha em branco; o pandoc renderizava tudo corrido na ementa.html e no .docx.
Inserida a linha em branco nos 8 blocos do conteúdo programático (seção 8).

Co-Authored-By: Claude Opus 4.8 (1M context) <noreply@anthropic.com>
Claude-Session: https://claude.ai/code/session_017L3yDjVrwyFFQVUsfndpCA
</commit_message>
<xml_diff>
--- a/Ementa-Formal-Curso-Servidor-IA-v2.docx
+++ b/Ementa-Formal-Curso-Servidor-IA-v2.docx
@@ -1843,53 +1843,65 @@
         </w:rPr>
         <w:t xml:space="preserve">Encontro 1 — O que é IA e como pedir bem (3h)</w:t>
       </w:r>
-      <w:r>
-        <w:rPr>
-          <w:rFonts w:ascii="Calibri" w:hAnsi="Calibri"/>
-        </w:rPr>
-        <w:t xml:space="preserve"> </w:t>
-      </w:r>
-      <w:r>
-        <w:rPr>
-          <w:rFonts w:ascii="Calibri" w:hAnsi="Calibri"/>
-        </w:rPr>
-        <w:t xml:space="preserve">- Como a IA funciona: prever a próxima palavra; onde nasce a alucinação</w:t>
-      </w:r>
-      <w:r>
-        <w:rPr>
-          <w:rFonts w:ascii="Calibri" w:hAnsi="Calibri"/>
-        </w:rPr>
-        <w:t xml:space="preserve"> </w:t>
-      </w:r>
-      <w:r>
-        <w:rPr>
-          <w:rFonts w:ascii="Calibri" w:hAnsi="Calibri"/>
-        </w:rPr>
-        <w:t xml:space="preserve">- O que faz bem e onde falha — com exemplos do contexto judicial</w:t>
-      </w:r>
-      <w:r>
-        <w:rPr>
-          <w:rFonts w:ascii="Calibri" w:hAnsi="Calibri"/>
-        </w:rPr>
-        <w:t xml:space="preserve"> </w:t>
-      </w:r>
-      <w:r>
-        <w:rPr>
-          <w:rFonts w:ascii="Calibri" w:hAnsi="Calibri"/>
-        </w:rPr>
-        <w:t xml:space="preserve">- Contexto e tokens: por que não despejar o processo inteiro na ferramenta</w:t>
-      </w:r>
-      <w:r>
-        <w:rPr>
-          <w:rFonts w:ascii="Calibri" w:hAnsi="Calibri"/>
-        </w:rPr>
-        <w:t xml:space="preserve"> </w:t>
-      </w:r>
-      <w:r>
-        <w:rPr>
-          <w:rFonts w:ascii="Calibri" w:hAnsi="Calibri"/>
-        </w:rPr>
-        <w:t xml:space="preserve">- Anatomia do</w:t>
+    </w:p>
+    <w:p>
+      <w:pPr>
+        <w:pStyle w:val="Compact"/>
+        <w:numPr>
+          <w:ilvl w:val="0"/>
+          <w:numId w:val="1003"/>
+        </w:numPr>
+      </w:pPr>
+      <w:r>
+        <w:rPr>
+          <w:rFonts w:ascii="Calibri" w:hAnsi="Calibri"/>
+        </w:rPr>
+        <w:t xml:space="preserve">Como a IA funciona: prever a próxima palavra; onde nasce a alucinação</w:t>
+      </w:r>
+    </w:p>
+    <w:p>
+      <w:pPr>
+        <w:pStyle w:val="Compact"/>
+        <w:numPr>
+          <w:ilvl w:val="0"/>
+          <w:numId w:val="1003"/>
+        </w:numPr>
+      </w:pPr>
+      <w:r>
+        <w:rPr>
+          <w:rFonts w:ascii="Calibri" w:hAnsi="Calibri"/>
+        </w:rPr>
+        <w:t xml:space="preserve">O que faz bem e onde falha — com exemplos do contexto judicial</w:t>
+      </w:r>
+    </w:p>
+    <w:p>
+      <w:pPr>
+        <w:pStyle w:val="Compact"/>
+        <w:numPr>
+          <w:ilvl w:val="0"/>
+          <w:numId w:val="1003"/>
+        </w:numPr>
+      </w:pPr>
+      <w:r>
+        <w:rPr>
+          <w:rFonts w:ascii="Calibri" w:hAnsi="Calibri"/>
+        </w:rPr>
+        <w:t xml:space="preserve">Contexto e tokens: por que não despejar o processo inteiro na ferramenta</w:t>
+      </w:r>
+    </w:p>
+    <w:p>
+      <w:pPr>
+        <w:pStyle w:val="Compact"/>
+        <w:numPr>
+          <w:ilvl w:val="0"/>
+          <w:numId w:val="1003"/>
+        </w:numPr>
+      </w:pPr>
+      <w:r>
+        <w:rPr>
+          <w:rFonts w:ascii="Calibri" w:hAnsi="Calibri"/>
+        </w:rPr>
+        <w:t xml:space="preserve">Anatomia do</w:t>
       </w:r>
       <w:r>
         <w:rPr>
@@ -1914,7 +1926,7 @@
     </w:p>
     <w:p>
       <w:pPr>
-        <w:pStyle w:val="BodyText"/>
+        <w:pStyle w:val="FirstParagraph"/>
       </w:pPr>
       <w:r>
         <w:rPr>
@@ -1922,53 +1934,65 @@
         </w:rPr>
         <w:t xml:space="preserve">Encontro 2 — Prompts melhores e biblioteca (3h)</w:t>
       </w:r>
-      <w:r>
-        <w:rPr>
-          <w:rFonts w:ascii="Calibri" w:hAnsi="Calibri"/>
-        </w:rPr>
-        <w:t xml:space="preserve"> </w:t>
-      </w:r>
-      <w:r>
-        <w:rPr>
-          <w:rFonts w:ascii="Calibri" w:hAnsi="Calibri"/>
-        </w:rPr>
-        <w:t xml:space="preserve">- Prompt fraco × prompt forte: o mesmo pedido, duas saídas</w:t>
-      </w:r>
-      <w:r>
-        <w:rPr>
-          <w:rFonts w:ascii="Calibri" w:hAnsi="Calibri"/>
-        </w:rPr>
-        <w:t xml:space="preserve"> </w:t>
-      </w:r>
-      <w:r>
-        <w:rPr>
-          <w:rFonts w:ascii="Calibri" w:hAnsi="Calibri"/>
-        </w:rPr>
-        <w:t xml:space="preserve">- Técnicas que elevam a qualidade: raciocínio passo a passo, exemplos calibradores, separação entre instrução e documento (inclusive contra instrução embutida), iteração</w:t>
-      </w:r>
-      <w:r>
-        <w:rPr>
-          <w:rFonts w:ascii="Calibri" w:hAnsi="Calibri"/>
-        </w:rPr>
-        <w:t xml:space="preserve"> </w:t>
-      </w:r>
-      <w:r>
-        <w:rPr>
-          <w:rFonts w:ascii="Calibri" w:hAnsi="Calibri"/>
-        </w:rPr>
-        <w:t xml:space="preserve">- Biblioteca de prompts da unidade: o Banco de Prompts (14 prompts-mestre + apêndices)</w:t>
-      </w:r>
-      <w:r>
-        <w:rPr>
-          <w:rFonts w:ascii="Calibri" w:hAnsi="Calibri"/>
-        </w:rPr>
-        <w:t xml:space="preserve"> </w:t>
-      </w:r>
-      <w:r>
-        <w:rPr>
-          <w:rFonts w:ascii="Calibri" w:hAnsi="Calibri"/>
-        </w:rPr>
-        <w:t xml:space="preserve">- Qual ferramenta usar: escolha pela tarefa, não pela marca — o método importa mais que a ferramenta</w:t>
+    </w:p>
+    <w:p>
+      <w:pPr>
+        <w:pStyle w:val="Compact"/>
+        <w:numPr>
+          <w:ilvl w:val="0"/>
+          <w:numId w:val="1004"/>
+        </w:numPr>
+      </w:pPr>
+      <w:r>
+        <w:rPr>
+          <w:rFonts w:ascii="Calibri" w:hAnsi="Calibri"/>
+        </w:rPr>
+        <w:t xml:space="preserve">Prompt fraco × prompt forte: o mesmo pedido, duas saídas</w:t>
+      </w:r>
+    </w:p>
+    <w:p>
+      <w:pPr>
+        <w:pStyle w:val="Compact"/>
+        <w:numPr>
+          <w:ilvl w:val="0"/>
+          <w:numId w:val="1004"/>
+        </w:numPr>
+      </w:pPr>
+      <w:r>
+        <w:rPr>
+          <w:rFonts w:ascii="Calibri" w:hAnsi="Calibri"/>
+        </w:rPr>
+        <w:t xml:space="preserve">Técnicas que elevam a qualidade: raciocínio passo a passo, exemplos calibradores, separação entre instrução e documento (inclusive contra instrução embutida), iteração</w:t>
+      </w:r>
+    </w:p>
+    <w:p>
+      <w:pPr>
+        <w:pStyle w:val="Compact"/>
+        <w:numPr>
+          <w:ilvl w:val="0"/>
+          <w:numId w:val="1004"/>
+        </w:numPr>
+      </w:pPr>
+      <w:r>
+        <w:rPr>
+          <w:rFonts w:ascii="Calibri" w:hAnsi="Calibri"/>
+        </w:rPr>
+        <w:t xml:space="preserve">Biblioteca de prompts da unidade: o Banco de Prompts (14 prompts-mestre + apêndices)</w:t>
+      </w:r>
+    </w:p>
+    <w:p>
+      <w:pPr>
+        <w:pStyle w:val="Compact"/>
+        <w:numPr>
+          <w:ilvl w:val="0"/>
+          <w:numId w:val="1004"/>
+        </w:numPr>
+      </w:pPr>
+      <w:r>
+        <w:rPr>
+          <w:rFonts w:ascii="Calibri" w:hAnsi="Calibri"/>
+        </w:rPr>
+        <w:t xml:space="preserve">Qual ferramenta usar: escolha pela tarefa, não pela marca — o método importa mais que a ferramenta</w:t>
       </w:r>
     </w:p>
     <w:bookmarkEnd w:id="27"/>
@@ -1994,82 +2018,91 @@
         </w:rPr>
         <w:t xml:space="preserve">Encontro 1 — Correlação, causa oculta e contrafactual (3h)</w:t>
       </w:r>
-      <w:r>
-        <w:rPr>
-          <w:rFonts w:ascii="Calibri" w:hAnsi="Calibri"/>
-        </w:rPr>
-        <w:t xml:space="preserve"> </w:t>
-      </w:r>
-      <w:r>
-        <w:rPr>
-          <w:rFonts w:ascii="Calibri" w:hAnsi="Calibri"/>
-        </w:rPr>
-        <w:t xml:space="preserve">- Por que questionar a IA: copiloto, não juiz</w:t>
-      </w:r>
-      <w:r>
-        <w:rPr>
-          <w:rFonts w:ascii="Calibri" w:hAnsi="Calibri"/>
-        </w:rPr>
-        <w:t xml:space="preserve"> </w:t>
-      </w:r>
-      <w:r>
-        <w:rPr>
-          <w:rFonts w:ascii="Calibri" w:hAnsi="Calibri"/>
-        </w:rPr>
-        <w:t xml:space="preserve">- Correlação não é causa: a causa oculta (confundidor) — do cotidiano ao judicial</w:t>
-      </w:r>
-      <w:r>
-        <w:rPr>
-          <w:rFonts w:ascii="Calibri" w:hAnsi="Calibri"/>
-        </w:rPr>
-        <w:t xml:space="preserve"> </w:t>
-      </w:r>
-      <w:r>
-        <w:rPr>
-          <w:rFonts w:ascii="Calibri" w:hAnsi="Calibri"/>
-        </w:rPr>
-        <w:t xml:space="preserve">- Pensamento contrafactual:</w:t>
-      </w:r>
-      <w:r>
-        <w:rPr>
-          <w:rFonts w:ascii="Calibri" w:hAnsi="Calibri"/>
-        </w:rPr>
-        <w:t xml:space="preserve"> </w:t>
-      </w:r>
-      <w:r>
-        <w:rPr>
-          <w:rFonts w:ascii="Calibri" w:hAnsi="Calibri"/>
-        </w:rPr>
-        <w:t xml:space="preserve">“</w:t>
-      </w:r>
-      <w:r>
-        <w:rPr>
-          <w:rFonts w:ascii="Calibri" w:hAnsi="Calibri"/>
-        </w:rPr>
-        <w:t xml:space="preserve">e se não tivéssemos adotado?</w:t>
-      </w:r>
-      <w:r>
-        <w:rPr>
-          <w:rFonts w:ascii="Calibri" w:hAnsi="Calibri"/>
-        </w:rPr>
-        <w:t xml:space="preserve">”</w:t>
-      </w:r>
-      <w:r>
-        <w:rPr>
-          <w:rFonts w:ascii="Calibri" w:hAnsi="Calibri"/>
-        </w:rPr>
-        <w:t xml:space="preserve"> </w:t>
-      </w:r>
-      <w:r>
-        <w:rPr>
-          <w:rFonts w:ascii="Calibri" w:hAnsi="Calibri"/>
-        </w:rPr>
-        <w:t xml:space="preserve">— tendência anterior, grupo de comparação e registro de baseline</w:t>
-      </w:r>
     </w:p>
     <w:p>
       <w:pPr>
-        <w:pStyle w:val="BodyText"/>
+        <w:pStyle w:val="Compact"/>
+        <w:numPr>
+          <w:ilvl w:val="0"/>
+          <w:numId w:val="1005"/>
+        </w:numPr>
+      </w:pPr>
+      <w:r>
+        <w:rPr>
+          <w:rFonts w:ascii="Calibri" w:hAnsi="Calibri"/>
+        </w:rPr>
+        <w:t xml:space="preserve">Por que questionar a IA: copiloto, não juiz</w:t>
+      </w:r>
+    </w:p>
+    <w:p>
+      <w:pPr>
+        <w:pStyle w:val="Compact"/>
+        <w:numPr>
+          <w:ilvl w:val="0"/>
+          <w:numId w:val="1005"/>
+        </w:numPr>
+      </w:pPr>
+      <w:r>
+        <w:rPr>
+          <w:rFonts w:ascii="Calibri" w:hAnsi="Calibri"/>
+        </w:rPr>
+        <w:t xml:space="preserve">Correlação não é causa: a causa oculta (confundidor) — do cotidiano ao judicial</w:t>
+      </w:r>
+    </w:p>
+    <w:p>
+      <w:pPr>
+        <w:pStyle w:val="Compact"/>
+        <w:numPr>
+          <w:ilvl w:val="0"/>
+          <w:numId w:val="1005"/>
+        </w:numPr>
+      </w:pPr>
+      <w:r>
+        <w:rPr>
+          <w:rFonts w:ascii="Calibri" w:hAnsi="Calibri"/>
+        </w:rPr>
+        <w:t xml:space="preserve">Pensamento contrafactual:</w:t>
+      </w:r>
+      <w:r>
+        <w:rPr>
+          <w:rFonts w:ascii="Calibri" w:hAnsi="Calibri"/>
+        </w:rPr>
+        <w:t xml:space="preserve"> </w:t>
+      </w:r>
+      <w:r>
+        <w:rPr>
+          <w:rFonts w:ascii="Calibri" w:hAnsi="Calibri"/>
+        </w:rPr>
+        <w:t xml:space="preserve">“</w:t>
+      </w:r>
+      <w:r>
+        <w:rPr>
+          <w:rFonts w:ascii="Calibri" w:hAnsi="Calibri"/>
+        </w:rPr>
+        <w:t xml:space="preserve">e se não tivéssemos adotado?</w:t>
+      </w:r>
+      <w:r>
+        <w:rPr>
+          <w:rFonts w:ascii="Calibri" w:hAnsi="Calibri"/>
+        </w:rPr>
+        <w:t xml:space="preserve">”</w:t>
+      </w:r>
+      <w:r>
+        <w:rPr>
+          <w:rFonts w:ascii="Calibri" w:hAnsi="Calibri"/>
+        </w:rPr>
+        <w:t xml:space="preserve"> </w:t>
+      </w:r>
+      <w:r>
+        <w:rPr>
+          <w:rFonts w:ascii="Calibri" w:hAnsi="Calibri"/>
+        </w:rPr>
+        <w:t xml:space="preserve">— tendência anterior, grupo de comparação e registro de baseline</w:t>
+      </w:r>
+    </w:p>
+    <w:p>
+      <w:pPr>
+        <w:pStyle w:val="FirstParagraph"/>
       </w:pPr>
       <w:r>
         <w:rPr>
@@ -2077,41 +2110,50 @@
         </w:rPr>
         <w:t xml:space="preserve">Encontro 2 — Alucinações, validação e checklist (3h)</w:t>
       </w:r>
-      <w:r>
-        <w:rPr>
-          <w:rFonts w:ascii="Calibri" w:hAnsi="Calibri"/>
-        </w:rPr>
-        <w:t xml:space="preserve"> </w:t>
-      </w:r>
-      <w:r>
-        <w:rPr>
-          <w:rFonts w:ascii="Calibri" w:hAnsi="Calibri"/>
-        </w:rPr>
-        <w:t xml:space="preserve">- Detectar alucinações: sinais de alerta; citação inventada e conferência na fonte oficial</w:t>
-      </w:r>
-      <w:r>
-        <w:rPr>
-          <w:rFonts w:ascii="Calibri" w:hAnsi="Calibri"/>
-        </w:rPr>
-        <w:t xml:space="preserve"> </w:t>
-      </w:r>
-      <w:r>
-        <w:rPr>
-          <w:rFonts w:ascii="Calibri" w:hAnsi="Calibri"/>
-        </w:rPr>
-        <w:t xml:space="preserve">- Validar antes de confiar: cruzar fontes; pedir à IA que aponte as próprias fraquezas</w:t>
-      </w:r>
-      <w:r>
-        <w:rPr>
-          <w:rFonts w:ascii="Calibri" w:hAnsi="Calibri"/>
-        </w:rPr>
-        <w:t xml:space="preserve"> </w:t>
-      </w:r>
-      <w:r>
-        <w:rPr>
-          <w:rFonts w:ascii="Calibri" w:hAnsi="Calibri"/>
-        </w:rPr>
-        <w:t xml:space="preserve">- Checklist de supervisão e decisão humana; auditoria da</w:t>
+    </w:p>
+    <w:p>
+      <w:pPr>
+        <w:pStyle w:val="Compact"/>
+        <w:numPr>
+          <w:ilvl w:val="0"/>
+          <w:numId w:val="1006"/>
+        </w:numPr>
+      </w:pPr>
+      <w:r>
+        <w:rPr>
+          <w:rFonts w:ascii="Calibri" w:hAnsi="Calibri"/>
+        </w:rPr>
+        <w:t xml:space="preserve">Detectar alucinações: sinais de alerta; citação inventada e conferência na fonte oficial</w:t>
+      </w:r>
+    </w:p>
+    <w:p>
+      <w:pPr>
+        <w:pStyle w:val="Compact"/>
+        <w:numPr>
+          <w:ilvl w:val="0"/>
+          <w:numId w:val="1006"/>
+        </w:numPr>
+      </w:pPr>
+      <w:r>
+        <w:rPr>
+          <w:rFonts w:ascii="Calibri" w:hAnsi="Calibri"/>
+        </w:rPr>
+        <w:t xml:space="preserve">Validar antes de confiar: cruzar fontes; pedir à IA que aponte as próprias fraquezas</w:t>
+      </w:r>
+    </w:p>
+    <w:p>
+      <w:pPr>
+        <w:pStyle w:val="Compact"/>
+        <w:numPr>
+          <w:ilvl w:val="0"/>
+          <w:numId w:val="1006"/>
+        </w:numPr>
+      </w:pPr>
+      <w:r>
+        <w:rPr>
+          <w:rFonts w:ascii="Calibri" w:hAnsi="Calibri"/>
+        </w:rPr>
+        <w:t xml:space="preserve">Checklist de supervisão e decisão humana; auditoria da</w:t>
       </w:r>
       <w:r>
         <w:rPr>
@@ -2173,81 +2215,96 @@
         </w:rPr>
         <w:t xml:space="preserve">Aula 1 — Triagem e resumo (3h)</w:t>
       </w:r>
-      <w:r>
-        <w:rPr>
-          <w:rFonts w:ascii="Calibri" w:hAnsi="Calibri"/>
-        </w:rPr>
-        <w:t xml:space="preserve"> </w:t>
-      </w:r>
-      <w:r>
-        <w:rPr>
-          <w:rFonts w:ascii="Calibri" w:hAnsi="Calibri"/>
-        </w:rPr>
-        <w:t xml:space="preserve">- Triagem e classificação assistida (demonstração ao vivo com lote de demandas — incluindo defesa contra instrução embutida em item do lote)</w:t>
-      </w:r>
-      <w:r>
-        <w:rPr>
-          <w:rFonts w:ascii="Calibri" w:hAnsi="Calibri"/>
-        </w:rPr>
-        <w:t xml:space="preserve"> </w:t>
-      </w:r>
-      <w:r>
-        <w:rPr>
-          <w:rFonts w:ascii="Calibri" w:hAnsi="Calibri"/>
-        </w:rPr>
-        <w:t xml:space="preserve">- Resumo de peças e processos, com conferência contra o original</w:t>
-      </w:r>
     </w:p>
     <w:p>
       <w:pPr>
-        <w:pStyle w:val="BodyText"/>
-      </w:pPr>
-      <w:r>
-        <w:rPr>
-          <w:rFonts w:ascii="Calibri" w:hAnsi="Calibri"/>
-        </w:rPr>
-        <w:t xml:space="preserve">Aula 2 — Minutas, jurisprudência e conferência (3h)</w:t>
-      </w:r>
-      <w:r>
-        <w:rPr>
-          <w:rFonts w:ascii="Calibri" w:hAnsi="Calibri"/>
-        </w:rPr>
-        <w:t xml:space="preserve"> </w:t>
-      </w:r>
-      <w:r>
-        <w:rPr>
-          <w:rFonts w:ascii="Calibri" w:hAnsi="Calibri"/>
-        </w:rPr>
-        <w:t xml:space="preserve">- Minutas e despachos com supervisão crítica — o conteúdo jurídico e a assinatura são sempre do servidor</w:t>
-      </w:r>
-      <w:r>
-        <w:rPr>
-          <w:rFonts w:ascii="Calibri" w:hAnsi="Calibri"/>
-        </w:rPr>
-        <w:t xml:space="preserve"> </w:t>
-      </w:r>
-      <w:r>
-        <w:rPr>
-          <w:rFonts w:ascii="Calibri" w:hAnsi="Calibri"/>
-        </w:rPr>
-        <w:t xml:space="preserve">- Pesquisa de jurisprudência com salvaguardas contra alucinação — conferência na fonte oficial</w:t>
-      </w:r>
-      <w:r>
-        <w:rPr>
-          <w:rFonts w:ascii="Calibri" w:hAnsi="Calibri"/>
-        </w:rPr>
-        <w:t xml:space="preserve"> </w:t>
-      </w:r>
-      <w:r>
-        <w:rPr>
-          <w:rFonts w:ascii="Calibri" w:hAnsi="Calibri"/>
-        </w:rPr>
-        <w:t xml:space="preserve">- Comparação e conferência de documentos</w:t>
+        <w:pStyle w:val="Compact"/>
+        <w:numPr>
+          <w:ilvl w:val="0"/>
+          <w:numId w:val="1007"/>
+        </w:numPr>
+      </w:pPr>
+      <w:r>
+        <w:rPr>
+          <w:rFonts w:ascii="Calibri" w:hAnsi="Calibri"/>
+        </w:rPr>
+        <w:t xml:space="preserve">Triagem e classificação assistida (demonstração ao vivo com lote de demandas — incluindo defesa contra instrução embutida em item do lote)</w:t>
       </w:r>
     </w:p>
     <w:p>
       <w:pPr>
-        <w:pStyle w:val="BodyText"/>
+        <w:pStyle w:val="Compact"/>
+        <w:numPr>
+          <w:ilvl w:val="0"/>
+          <w:numId w:val="1007"/>
+        </w:numPr>
+      </w:pPr>
+      <w:r>
+        <w:rPr>
+          <w:rFonts w:ascii="Calibri" w:hAnsi="Calibri"/>
+        </w:rPr>
+        <w:t xml:space="preserve">Resumo de peças e processos, com conferência contra o original</w:t>
+      </w:r>
+    </w:p>
+    <w:p>
+      <w:pPr>
+        <w:pStyle w:val="FirstParagraph"/>
+      </w:pPr>
+      <w:r>
+        <w:rPr>
+          <w:rFonts w:ascii="Calibri" w:hAnsi="Calibri"/>
+        </w:rPr>
+        <w:t xml:space="preserve">Aula 2 — Minutas, jurisprudência e conferência (3h)</w:t>
+      </w:r>
+    </w:p>
+    <w:p>
+      <w:pPr>
+        <w:pStyle w:val="Compact"/>
+        <w:numPr>
+          <w:ilvl w:val="0"/>
+          <w:numId w:val="1008"/>
+        </w:numPr>
+      </w:pPr>
+      <w:r>
+        <w:rPr>
+          <w:rFonts w:ascii="Calibri" w:hAnsi="Calibri"/>
+        </w:rPr>
+        <w:t xml:space="preserve">Minutas e despachos com supervisão crítica — o conteúdo jurídico e a assinatura são sempre do servidor</w:t>
+      </w:r>
+    </w:p>
+    <w:p>
+      <w:pPr>
+        <w:pStyle w:val="Compact"/>
+        <w:numPr>
+          <w:ilvl w:val="0"/>
+          <w:numId w:val="1008"/>
+        </w:numPr>
+      </w:pPr>
+      <w:r>
+        <w:rPr>
+          <w:rFonts w:ascii="Calibri" w:hAnsi="Calibri"/>
+        </w:rPr>
+        <w:t xml:space="preserve">Pesquisa de jurisprudência com salvaguardas contra alucinação — conferência na fonte oficial</w:t>
+      </w:r>
+    </w:p>
+    <w:p>
+      <w:pPr>
+        <w:pStyle w:val="Compact"/>
+        <w:numPr>
+          <w:ilvl w:val="0"/>
+          <w:numId w:val="1008"/>
+        </w:numPr>
+      </w:pPr>
+      <w:r>
+        <w:rPr>
+          <w:rFonts w:ascii="Calibri" w:hAnsi="Calibri"/>
+        </w:rPr>
+        <w:t xml:space="preserve">Comparação e conferência de documentos</w:t>
+      </w:r>
+    </w:p>
+    <w:p>
+      <w:pPr>
+        <w:pStyle w:val="FirstParagraph"/>
       </w:pPr>
       <w:r>
         <w:rPr>
@@ -2255,48 +2312,45 @@
         </w:rPr>
         <w:t xml:space="preserve">Aula 3 — Relatórios, lote e projeto integrador (4h)</w:t>
       </w:r>
-      <w:r>
-        <w:rPr>
-          <w:rFonts w:ascii="Calibri" w:hAnsi="Calibri"/>
-        </w:rPr>
-        <w:t xml:space="preserve"> </w:t>
-      </w:r>
-      <w:r>
-        <w:rPr>
-          <w:rFonts w:ascii="Calibri" w:hAnsi="Calibri"/>
-        </w:rPr>
-        <w:t xml:space="preserve">- Relatórios e organização de dados</w:t>
-      </w:r>
-      <w:r>
-        <w:rPr>
-          <w:rFonts w:ascii="Calibri" w:hAnsi="Calibri"/>
-        </w:rPr>
-        <w:t xml:space="preserve"> </w:t>
-      </w:r>
-      <w:r>
-        <w:rPr>
-          <w:rFonts w:ascii="Calibri" w:hAnsi="Calibri"/>
-        </w:rPr>
-        <w:t xml:space="preserve">- Modelos e trabalho em lote, com anonimização prévia</w:t>
-      </w:r>
-      <w:r>
-        <w:rPr>
-          <w:rFonts w:ascii="Calibri" w:hAnsi="Calibri"/>
-        </w:rPr>
-        <w:t xml:space="preserve"> </w:t>
-      </w:r>
-      <w:r>
-        <w:rPr>
-          <w:rFonts w:ascii="Calibri" w:hAnsi="Calibri"/>
-        </w:rPr>
-        <w:t xml:space="preserve">-</w:t>
-      </w:r>
-      <w:r>
-        <w:rPr>
-          <w:rFonts w:ascii="Calibri" w:hAnsi="Calibri"/>
-        </w:rPr>
-        <w:t xml:space="preserve"> </w:t>
-      </w:r>
+    </w:p>
+    <w:p>
+      <w:pPr>
+        <w:pStyle w:val="Compact"/>
+        <w:numPr>
+          <w:ilvl w:val="0"/>
+          <w:numId w:val="1009"/>
+        </w:numPr>
+      </w:pPr>
+      <w:r>
+        <w:rPr>
+          <w:rFonts w:ascii="Calibri" w:hAnsi="Calibri"/>
+        </w:rPr>
+        <w:t xml:space="preserve">Relatórios e organização de dados</w:t>
+      </w:r>
+    </w:p>
+    <w:p>
+      <w:pPr>
+        <w:pStyle w:val="Compact"/>
+        <w:numPr>
+          <w:ilvl w:val="0"/>
+          <w:numId w:val="1009"/>
+        </w:numPr>
+      </w:pPr>
+      <w:r>
+        <w:rPr>
+          <w:rFonts w:ascii="Calibri" w:hAnsi="Calibri"/>
+        </w:rPr>
+        <w:t xml:space="preserve">Modelos e trabalho em lote, com anonimização prévia</w:t>
+      </w:r>
+    </w:p>
+    <w:p>
+      <w:pPr>
+        <w:pStyle w:val="Compact"/>
+        <w:numPr>
+          <w:ilvl w:val="0"/>
+          <w:numId w:val="1009"/>
+        </w:numPr>
+      </w:pPr>
       <w:r>
         <w:rPr>
           <w:rFonts w:ascii="Calibri" w:hAnsi="Calibri"/>
@@ -2349,65 +2403,80 @@
         </w:rPr>
         <w:t xml:space="preserve">Encontro único — Usar a IA dentro da lei e do sigilo (2h)</w:t>
       </w:r>
-      <w:r>
-        <w:rPr>
-          <w:rFonts w:ascii="Calibri" w:hAnsi="Calibri"/>
-        </w:rPr>
-        <w:t xml:space="preserve"> </w:t>
-      </w:r>
-      <w:r>
-        <w:rPr>
-          <w:rFonts w:ascii="Calibri" w:hAnsi="Calibri"/>
-        </w:rPr>
-        <w:t xml:space="preserve">- Resolução CNJ nº 615/2025: governança e supervisão humana obrigatória</w:t>
-      </w:r>
-      <w:r>
-        <w:rPr>
-          <w:rFonts w:ascii="Calibri" w:hAnsi="Calibri"/>
-        </w:rPr>
-        <w:t xml:space="preserve"> </w:t>
-      </w:r>
-      <w:r>
-        <w:rPr>
-          <w:rFonts w:ascii="Calibri" w:hAnsi="Calibri"/>
-        </w:rPr>
-        <w:t xml:space="preserve">- Sigilo: o que pode e o que não pode ir para a IA — bloqueio absoluto a dados sob segredo de justiça em ferramenta externa</w:t>
-      </w:r>
-      <w:r>
-        <w:rPr>
-          <w:rFonts w:ascii="Calibri" w:hAnsi="Calibri"/>
-        </w:rPr>
-        <w:t xml:space="preserve"> </w:t>
-      </w:r>
-      <w:r>
-        <w:rPr>
-          <w:rFonts w:ascii="Calibri" w:hAnsi="Calibri"/>
-        </w:rPr>
-        <w:t xml:space="preserve">- LGPD e anonimização na prática</w:t>
-      </w:r>
-      <w:r>
-        <w:rPr>
-          <w:rFonts w:ascii="Calibri" w:hAnsi="Calibri"/>
-        </w:rPr>
-        <w:t xml:space="preserve"> </w:t>
-      </w:r>
-      <w:r>
-        <w:rPr>
-          <w:rFonts w:ascii="Calibri" w:hAnsi="Calibri"/>
-        </w:rPr>
-        <w:t xml:space="preserve">- Vieses algorítmicos e boas práticas de segurança</w:t>
-      </w:r>
-      <w:r>
-        <w:rPr>
-          <w:rFonts w:ascii="Calibri" w:hAnsi="Calibri"/>
-        </w:rPr>
-        <w:t xml:space="preserve"> </w:t>
-      </w:r>
-      <w:r>
-        <w:rPr>
-          <w:rFonts w:ascii="Calibri" w:hAnsi="Calibri"/>
-        </w:rPr>
-        <w:t xml:space="preserve">- Estudo de casos (</w:t>
+    </w:p>
+    <w:p>
+      <w:pPr>
+        <w:pStyle w:val="Compact"/>
+        <w:numPr>
+          <w:ilvl w:val="0"/>
+          <w:numId w:val="1010"/>
+        </w:numPr>
+      </w:pPr>
+      <w:r>
+        <w:rPr>
+          <w:rFonts w:ascii="Calibri" w:hAnsi="Calibri"/>
+        </w:rPr>
+        <w:t xml:space="preserve">Resolução CNJ nº 615/2025: governança e supervisão humana obrigatória</w:t>
+      </w:r>
+    </w:p>
+    <w:p>
+      <w:pPr>
+        <w:pStyle w:val="Compact"/>
+        <w:numPr>
+          <w:ilvl w:val="0"/>
+          <w:numId w:val="1010"/>
+        </w:numPr>
+      </w:pPr>
+      <w:r>
+        <w:rPr>
+          <w:rFonts w:ascii="Calibri" w:hAnsi="Calibri"/>
+        </w:rPr>
+        <w:t xml:space="preserve">Sigilo: o que pode e o que não pode ir para a IA — bloqueio absoluto a dados sob segredo de justiça em ferramenta externa</w:t>
+      </w:r>
+    </w:p>
+    <w:p>
+      <w:pPr>
+        <w:pStyle w:val="Compact"/>
+        <w:numPr>
+          <w:ilvl w:val="0"/>
+          <w:numId w:val="1010"/>
+        </w:numPr>
+      </w:pPr>
+      <w:r>
+        <w:rPr>
+          <w:rFonts w:ascii="Calibri" w:hAnsi="Calibri"/>
+        </w:rPr>
+        <w:t xml:space="preserve">LGPD e anonimização na prática</w:t>
+      </w:r>
+    </w:p>
+    <w:p>
+      <w:pPr>
+        <w:pStyle w:val="Compact"/>
+        <w:numPr>
+          <w:ilvl w:val="0"/>
+          <w:numId w:val="1010"/>
+        </w:numPr>
+      </w:pPr>
+      <w:r>
+        <w:rPr>
+          <w:rFonts w:ascii="Calibri" w:hAnsi="Calibri"/>
+        </w:rPr>
+        <w:t xml:space="preserve">Vieses algorítmicos e boas práticas de segurança</w:t>
+      </w:r>
+    </w:p>
+    <w:p>
+      <w:pPr>
+        <w:pStyle w:val="Compact"/>
+        <w:numPr>
+          <w:ilvl w:val="0"/>
+          <w:numId w:val="1010"/>
+        </w:numPr>
+      </w:pPr>
+      <w:r>
+        <w:rPr>
+          <w:rFonts w:ascii="Calibri" w:hAnsi="Calibri"/>
+        </w:rPr>
+        <w:t xml:space="preserve">Estudo de casos (</w:t>
       </w:r>
       <w:r>
         <w:rPr>
@@ -2433,17 +2502,20 @@
         </w:rPr>
         <w:t xml:space="preserve">): cada participante decide caso a caso e justifica; a discussão é feita com a turma inteira</w:t>
       </w:r>
-      <w:r>
-        <w:rPr>
-          <w:rFonts w:ascii="Calibri" w:hAnsi="Calibri"/>
-        </w:rPr>
-        <w:t xml:space="preserve"> </w:t>
-      </w:r>
-      <w:r>
-        <w:rPr>
-          <w:rFonts w:ascii="Calibri" w:hAnsi="Calibri"/>
-        </w:rPr>
-        <w:t xml:space="preserve">- Bloco-horizonte de encerramento: sistemas agênticos — assistente × agente, o servidor como regente, autonomia com responsabilidade</w:t>
+    </w:p>
+    <w:p>
+      <w:pPr>
+        <w:pStyle w:val="Compact"/>
+        <w:numPr>
+          <w:ilvl w:val="0"/>
+          <w:numId w:val="1010"/>
+        </w:numPr>
+      </w:pPr>
+      <w:r>
+        <w:rPr>
+          <w:rFonts w:ascii="Calibri" w:hAnsi="Calibri"/>
+        </w:rPr>
+        <w:t xml:space="preserve">Bloco-horizonte de encerramento: sistemas agênticos — assistente × agente, o servidor como regente, autonomia com responsabilidade</w:t>
       </w:r>
     </w:p>
     <w:bookmarkEnd w:id="30"/>
@@ -3853,7 +3925,7 @@
         <w:pStyle w:val="Compact"/>
         <w:numPr>
           <w:ilvl w:val="0"/>
-          <w:numId w:val="1003"/>
+          <w:numId w:val="1011"/>
         </w:numPr>
       </w:pPr>
       <w:r>
@@ -3868,7 +3940,7 @@
         <w:pStyle w:val="Compact"/>
         <w:numPr>
           <w:ilvl w:val="0"/>
-          <w:numId w:val="1003"/>
+          <w:numId w:val="1011"/>
         </w:numPr>
       </w:pPr>
       <w:r>
@@ -3883,7 +3955,7 @@
         <w:pStyle w:val="Compact"/>
         <w:numPr>
           <w:ilvl w:val="0"/>
-          <w:numId w:val="1003"/>
+          <w:numId w:val="1011"/>
         </w:numPr>
       </w:pPr>
       <w:r>
@@ -3898,7 +3970,7 @@
         <w:pStyle w:val="Compact"/>
         <w:numPr>
           <w:ilvl w:val="0"/>
-          <w:numId w:val="1003"/>
+          <w:numId w:val="1011"/>
         </w:numPr>
       </w:pPr>
       <w:r>
@@ -3913,7 +3985,7 @@
         <w:pStyle w:val="Compact"/>
         <w:numPr>
           <w:ilvl w:val="0"/>
-          <w:numId w:val="1003"/>
+          <w:numId w:val="1011"/>
         </w:numPr>
       </w:pPr>
       <w:r>
@@ -3939,7 +4011,7 @@
         <w:pStyle w:val="Compact"/>
         <w:numPr>
           <w:ilvl w:val="0"/>
-          <w:numId w:val="1004"/>
+          <w:numId w:val="1012"/>
         </w:numPr>
       </w:pPr>
       <w:r>
@@ -3954,7 +4026,7 @@
         <w:pStyle w:val="Compact"/>
         <w:numPr>
           <w:ilvl w:val="0"/>
-          <w:numId w:val="1004"/>
+          <w:numId w:val="1012"/>
         </w:numPr>
       </w:pPr>
       <w:r>
@@ -3969,7 +4041,7 @@
         <w:pStyle w:val="Compact"/>
         <w:numPr>
           <w:ilvl w:val="0"/>
-          <w:numId w:val="1004"/>
+          <w:numId w:val="1012"/>
         </w:numPr>
       </w:pPr>
       <w:r>
@@ -4939,7 +5011,7 @@
         <w:pStyle w:val="Compact"/>
         <w:numPr>
           <w:ilvl w:val="0"/>
-          <w:numId w:val="1005"/>
+          <w:numId w:val="1013"/>
         </w:numPr>
       </w:pPr>
       <w:r>
@@ -4954,7 +5026,7 @@
         <w:pStyle w:val="Compact"/>
         <w:numPr>
           <w:ilvl w:val="0"/>
-          <w:numId w:val="1005"/>
+          <w:numId w:val="1013"/>
         </w:numPr>
       </w:pPr>
       <w:r>
@@ -4969,7 +5041,7 @@
         <w:pStyle w:val="Compact"/>
         <w:numPr>
           <w:ilvl w:val="0"/>
-          <w:numId w:val="1005"/>
+          <w:numId w:val="1013"/>
         </w:numPr>
       </w:pPr>
       <w:r>
@@ -4984,7 +5056,7 @@
         <w:pStyle w:val="Compact"/>
         <w:numPr>
           <w:ilvl w:val="0"/>
-          <w:numId w:val="1005"/>
+          <w:numId w:val="1013"/>
         </w:numPr>
       </w:pPr>
       <w:r>
@@ -6552,6 +6624,30 @@
   <w:num w:numId="1005">
     <w:abstractNumId w:val="991"/>
   </w:num>
+  <w:num w:numId="1006">
+    <w:abstractNumId w:val="991"/>
+  </w:num>
+  <w:num w:numId="1007">
+    <w:abstractNumId w:val="991"/>
+  </w:num>
+  <w:num w:numId="1008">
+    <w:abstractNumId w:val="991"/>
+  </w:num>
+  <w:num w:numId="1009">
+    <w:abstractNumId w:val="991"/>
+  </w:num>
+  <w:num w:numId="1010">
+    <w:abstractNumId w:val="991"/>
+  </w:num>
+  <w:num w:numId="1011">
+    <w:abstractNumId w:val="991"/>
+  </w:num>
+  <w:num w:numId="1012">
+    <w:abstractNumId w:val="991"/>
+  </w:num>
+  <w:num w:numId="1013">
+    <w:abstractNumId w:val="991"/>
+  </w:num>
 </w:numbering>
 </file>
 

</xml_diff>